<commit_message>
Fix overlapping diagram text, add test result screenshot, and condense all 4 docs to exactly 15 pages total
</commit_message>
<xml_diff>
--- a/Second_Review_Documents/Topic1_Design.docx
+++ b/Second_Review_Documents/Topic1_Design.docx
@@ -58,7 +58,7 @@
           <w:color w:val="000000"/>
           <w:sz w:val="24"/>
         </w:rPr>
-        <w:t>The system design establishes the structural and behavioral architecture of the Community Lending Platform web application. The platform provides a decentralized, neighborhood-level web portal where residents can list unused household items and borrow resources from neighbors. By decoupling the presentation views, business logic controllers, and database persistence layers, the system guarantees high cohesion, maintainability, and data security.</w:t>
+        <w:t>The system design establishes the structural and behavioral architecture of the Community Lending Platform web application. The platform provides a neighborhood-level web portal enabling residents to share household items with low latency, high maintainability, and data security.</w:t>
       </w:r>
     </w:p>
     <w:p>
@@ -74,20 +74,6 @@
           <w:sz w:val="26"/>
         </w:rPr>
         <w:t>1.1 Layered Architectural Design</w:t>
-      </w:r>
-    </w:p>
-    <w:p>
-      <w:pPr>
-        <w:spacing w:line="360" w:lineRule="auto" w:after="80"/>
-        <w:jc w:val="both"/>
-      </w:pPr>
-      <w:r>
-        <w:rPr>
-          <w:rFonts w:ascii="Times New Roman" w:hAnsi="Times New Roman"/>
-          <w:color w:val="000000"/>
-          <w:sz w:val="24"/>
-        </w:rPr>
-        <w:t>The web application follows an N-tier client-server architectural pattern structured into four distinct layers:</w:t>
       </w:r>
     </w:p>
     <w:p>
@@ -111,7 +97,7 @@
           <w:color w:val="000000"/>
           <w:sz w:val="24"/>
         </w:rPr>
-        <w:t>Built using responsive HTML5, CSS3, and JavaScript ES6+. The user interface renders smoothly on desktop, tablet, and mobile web browsers without requiring separate native applications.</w:t>
+        <w:t>Responsive HTML5, CSS3, and JavaScript ES6+ rendering seamlessly across desktop, tablet, and mobile web browsers.</w:t>
       </w:r>
     </w:p>
     <w:p>
@@ -127,7 +113,7 @@
           <w:color w:val="000000"/>
           <w:sz w:val="24"/>
         </w:rPr>
-        <w:t xml:space="preserve">Application Gateway Tier (Web Server): </w:t>
+        <w:t xml:space="preserve">Web Gateway Tier (Server): </w:t>
       </w:r>
       <w:r>
         <w:rPr>
@@ -135,7 +121,7 @@
           <w:color w:val="000000"/>
           <w:sz w:val="24"/>
         </w:rPr>
-        <w:t>Managed by Gunicorn (WSGI HTTP server) on Render Cloud. It accepts incoming HTTPS web traffic, terminates SSL/TLS connections, and routes requests to the application workers.</w:t>
+        <w:t>Managed Gunicorn WSGI server on Render Cloud terminating TLS/SSL and routing incoming HTTP requests.</w:t>
       </w:r>
     </w:p>
     <w:p>
@@ -151,7 +137,7 @@
           <w:color w:val="000000"/>
           <w:sz w:val="24"/>
         </w:rPr>
-        <w:t xml:space="preserve">Business Logic Tier (Application Server): </w:t>
+        <w:t xml:space="preserve">Application Tier (Business Logic): </w:t>
       </w:r>
       <w:r>
         <w:rPr>
@@ -159,7 +145,7 @@
           <w:color w:val="000000"/>
           <w:sz w:val="24"/>
         </w:rPr>
-        <w:t>Comprises Python Flask route controllers in `app.py`. It handles cryptographic password hashing, user session verification, input sanitization, file uploads, and lending request state transitions.</w:t>
+        <w:t>Python Flask route handlers executing password hashing, session validation, file sanitization, and lending state transitions.</w:t>
       </w:r>
     </w:p>
     <w:p>
@@ -175,7 +161,7 @@
           <w:color w:val="000000"/>
           <w:sz w:val="24"/>
         </w:rPr>
-        <w:t xml:space="preserve">Data Persistence Tier (Database): </w:t>
+        <w:t xml:space="preserve">Persistence Tier (Database): </w:t>
       </w:r>
       <w:r>
         <w:rPr>
@@ -183,7 +169,7 @@
           <w:color w:val="000000"/>
           <w:sz w:val="24"/>
         </w:rPr>
-        <w:t>Powered by TiDB Serverless Cloud running the MySQL 8.0 protocol for ACID-compliant relational data storage, alongside local static disk storage for uploaded item photographs.</w:t>
+        <w:t>TiDB Serverless Cloud running MySQL 8.0 protocol for ACID relational storage, alongside static disk storage for uploaded photos.</w:t>
       </w:r>
     </w:p>
     <w:p>
@@ -212,7 +198,7 @@
           <w:color w:val="000000"/>
           <w:sz w:val="24"/>
         </w:rPr>
-        <w:t>Data Flow Diagrams model the movement, transformation, and storage of information throughout the web application across three increasing levels of detail.</w:t>
+        <w:t>Data Flow Diagrams model the movement, transformation, and storage of information across three levels of abstraction:</w:t>
       </w:r>
     </w:p>
     <w:p>
@@ -224,7 +210,7 @@
       <w:r>
         <w:drawing>
           <wp:inline xmlns:a="http://schemas.openxmlformats.org/drawingml/2006/main" xmlns:pic="http://schemas.openxmlformats.org/drawingml/2006/picture">
-            <wp:extent cx="4297680" cy="2332570"/>
+            <wp:extent cx="4023360" cy="2102572"/>
             <wp:docPr id="1" name="Picture 1"/>
             <wp:cNvGraphicFramePr>
               <a:graphicFrameLocks noChangeAspect="1"/>
@@ -245,7 +231,7 @@
                   <pic:spPr>
                     <a:xfrm>
                       <a:off x="0" y="0"/>
-                      <a:ext cx="4297680" cy="2332570"/>
+                      <a:ext cx="4023360" cy="2102572"/>
                     </a:xfrm>
                     <a:prstGeom prst="rect"/>
                   </pic:spPr>
@@ -283,7 +269,7 @@
           <w:color w:val="000000"/>
           <w:sz w:val="24"/>
         </w:rPr>
-        <w:t>The Context Level Diagram (Level 0) represents the entire Community Lending System as a single central process interacting with external human and institutional entities. Item Owners provide resource details and respond to borrow requests, Borrowers search the catalog and submit borrow requests, and Administrators monitor platform activity and audit transactions.</w:t>
+        <w:t>The Context Level Diagram (Level 0) represents the platform as a centralized system interacting with Item Owners, Borrowers, Community Members, and Administrators.</w:t>
       </w:r>
     </w:p>
     <w:p>
@@ -295,7 +281,7 @@
       <w:r>
         <w:drawing>
           <wp:inline xmlns:a="http://schemas.openxmlformats.org/drawingml/2006/main" xmlns:pic="http://schemas.openxmlformats.org/drawingml/2006/picture">
-            <wp:extent cx="4297680" cy="2511295"/>
+            <wp:extent cx="4023360" cy="2127236"/>
             <wp:docPr id="2" name="Picture 2"/>
             <wp:cNvGraphicFramePr>
               <a:graphicFrameLocks noChangeAspect="1"/>
@@ -316,7 +302,7 @@
                   <pic:spPr>
                     <a:xfrm>
                       <a:off x="0" y="0"/>
-                      <a:ext cx="4297680" cy="2511295"/>
+                      <a:ext cx="4023360" cy="2127236"/>
                     </a:xfrm>
                     <a:prstGeom prst="rect"/>
                   </pic:spPr>
@@ -354,7 +340,7 @@
           <w:color w:val="000000"/>
           <w:sz w:val="24"/>
         </w:rPr>
-        <w:t>The Level 1 DFD decomposes the central application into four core functional subsystems: (1.0) User Authentication and Profile Management, (2.0) Item Catalog Listing, (3.0) Search and Discovery Engine, and (4.0) Lending State Workflow Engine, showing data flows between subsystems and persistent tables (`users`, `items`, `lending_requests`).</w:t>
+        <w:t>The Level 1 DFD decomposes the system into four core functional subsystems: (1.0) User Auth, (2.0) Item Catalog, (3.0) Search Engine, and (4.0) Lending Workflow Engine interacting with data stores D1, D2, and D3.</w:t>
       </w:r>
     </w:p>
     <w:p>
@@ -366,7 +352,7 @@
       <w:r>
         <w:drawing>
           <wp:inline xmlns:a="http://schemas.openxmlformats.org/drawingml/2006/main" xmlns:pic="http://schemas.openxmlformats.org/drawingml/2006/picture">
-            <wp:extent cx="4297680" cy="2194772"/>
+            <wp:extent cx="4023360" cy="2028572"/>
             <wp:docPr id="3" name="Picture 3"/>
             <wp:cNvGraphicFramePr>
               <a:graphicFrameLocks noChangeAspect="1"/>
@@ -387,7 +373,7 @@
                   <pic:spPr>
                     <a:xfrm>
                       <a:off x="0" y="0"/>
-                      <a:ext cx="4297680" cy="2194772"/>
+                      <a:ext cx="4023360" cy="2028572"/>
                     </a:xfrm>
                     <a:prstGeom prst="rect"/>
                   </pic:spPr>
@@ -425,7 +411,7 @@
           <w:color w:val="000000"/>
           <w:sz w:val="24"/>
         </w:rPr>
-        <w:t>The Level 2 DFD details the complete transaction lifecycle of a borrow request. It traces the operational sequence: validating item availability, inserting a pending request record, notifying the owner, processing approval or rejection, and updating resource availability back to 'Available' upon return confirmation.</w:t>
+        <w:t>The Level 2 DFD outlines the borrowing lifecycle: validating availability, creating a pending request record, processing owner approval/rejection, and confirming returns.</w:t>
       </w:r>
     </w:p>
     <w:p>
@@ -454,7 +440,7 @@
           <w:color w:val="000000"/>
           <w:sz w:val="24"/>
         </w:rPr>
-        <w:t>UML diagrams provide standard object-oriented blueprints depicting user interactions and internal class relationships.</w:t>
+        <w:t>UML models illustrate system behavioral use cases and structural object relationships:</w:t>
       </w:r>
     </w:p>
     <w:p>
@@ -466,7 +452,7 @@
       <w:r>
         <w:drawing>
           <wp:inline xmlns:a="http://schemas.openxmlformats.org/drawingml/2006/main" xmlns:pic="http://schemas.openxmlformats.org/drawingml/2006/picture">
-            <wp:extent cx="4297680" cy="2518297"/>
+            <wp:extent cx="4023360" cy="2243635"/>
             <wp:docPr id="4" name="Picture 4"/>
             <wp:cNvGraphicFramePr>
               <a:graphicFrameLocks noChangeAspect="1"/>
@@ -487,7 +473,7 @@
                   <pic:spPr>
                     <a:xfrm>
                       <a:off x="0" y="0"/>
-                      <a:ext cx="4297680" cy="2518297"/>
+                      <a:ext cx="4023360" cy="2243635"/>
                     </a:xfrm>
                     <a:prstGeom prst="rect"/>
                   </pic:spPr>
@@ -525,7 +511,7 @@
           <w:color w:val="000000"/>
           <w:sz w:val="24"/>
         </w:rPr>
-        <w:t>The Use Case Diagram defines the functional scope of the platform. Primary actors include the Item Owner, Borrower, and Administrator interacting with use cases within the system boundary: registering accounts, listing household items, browsing the catalog, submitting borrow requests, approving/declining loans, and marking items as returned.</w:t>
+        <w:t>The Use Case Diagram defines functional user actions across the Item Owner, Borrower, and Administrator roles within the platform boundary.</w:t>
       </w:r>
     </w:p>
     <w:p>
@@ -537,7 +523,7 @@
       <w:r>
         <w:drawing>
           <wp:inline xmlns:a="http://schemas.openxmlformats.org/drawingml/2006/main" xmlns:pic="http://schemas.openxmlformats.org/drawingml/2006/picture">
-            <wp:extent cx="4297680" cy="2464472"/>
+            <wp:extent cx="4023360" cy="2243635"/>
             <wp:docPr id="5" name="Picture 5"/>
             <wp:cNvGraphicFramePr>
               <a:graphicFrameLocks noChangeAspect="1"/>
@@ -558,7 +544,7 @@
                   <pic:spPr>
                     <a:xfrm>
                       <a:off x="0" y="0"/>
-                      <a:ext cx="4297680" cy="2464472"/>
+                      <a:ext cx="4023360" cy="2243635"/>
                     </a:xfrm>
                     <a:prstGeom prst="rect"/>
                   </pic:spPr>
@@ -596,7 +582,7 @@
           <w:color w:val="000000"/>
           <w:sz w:val="24"/>
         </w:rPr>
-        <w:t>The Class Diagram models the core entity classes: `User`, `Item`, and `LendingRequest`. It details attributes, data types, visibility indicators, and member methods, along with structural associations and multiplicities (`1..* Lists`, `1..* Initiates`, `1..* Subject of`).</w:t>
+        <w:t>The Class Diagram details the structural classes: `User`, `Item`, and `LendingRequest` with attributes, methods, and multiplicities (`1..* Lists`, `1..* Initiates`).</w:t>
       </w:r>
     </w:p>
     <w:p>
@@ -625,55 +611,7 @@
           <w:color w:val="000000"/>
           <w:sz w:val="24"/>
         </w:rPr>
-        <w:t>Every architectural choice was evaluated through formal engineering trade-off studies:</w:t>
-      </w:r>
-    </w:p>
-    <w:p>
-      <w:pPr>
-        <w:pStyle w:val="ListBullet"/>
-        <w:spacing w:line="360" w:lineRule="auto" w:after="60"/>
-        <w:jc w:val="both"/>
-      </w:pPr>
-      <w:r>
-        <w:rPr>
-          <w:rFonts w:ascii="Times New Roman" w:hAnsi="Times New Roman"/>
-          <w:b/>
-          <w:color w:val="000000"/>
-          <w:sz w:val="24"/>
-        </w:rPr>
-        <w:t xml:space="preserve">Modular Monolith vs. Microservices: </w:t>
-      </w:r>
-      <w:r>
-        <w:rPr>
-          <w:rFonts w:ascii="Times New Roman" w:hAnsi="Times New Roman"/>
-          <w:color w:val="000000"/>
-          <w:sz w:val="24"/>
-        </w:rPr>
-        <w:t>Microservices introduce significant network latency, distributed transaction complexities, and multi-container hosting costs. A modular monolithic web architecture in Flask provides fast execution, ACID database transactions, and simple deployment on cloud hosting.</w:t>
-      </w:r>
-    </w:p>
-    <w:p>
-      <w:pPr>
-        <w:pStyle w:val="ListBullet"/>
-        <w:spacing w:line="360" w:lineRule="auto" w:after="60"/>
-        <w:jc w:val="both"/>
-      </w:pPr>
-      <w:r>
-        <w:rPr>
-          <w:rFonts w:ascii="Times New Roman" w:hAnsi="Times New Roman"/>
-          <w:b/>
-          <w:color w:val="000000"/>
-          <w:sz w:val="24"/>
-        </w:rPr>
-        <w:t xml:space="preserve">Server-Side Rendering (SSR) vs. Client-Side SPA: </w:t>
-      </w:r>
-      <w:r>
-        <w:rPr>
-          <w:rFonts w:ascii="Times New Roman" w:hAnsi="Times New Roman"/>
-          <w:color w:val="000000"/>
-          <w:sz w:val="24"/>
-        </w:rPr>
-        <w:t>A pure client-side SPA requires heavy JavaScript bundles that slow initial page loading on slower network connections. Server-side Jinja2 rendering delivers fast initial page loads (&lt;300ms) with zero client bundle compilation.</w:t>
+        <w:t>A modular monolithic architecture in Flask was selected over microservices for zero inter-module latency, ACID transactions, and lower hosting complexity:</w:t>
       </w:r>
     </w:p>
     <w:tbl>
@@ -940,7 +878,7 @@
                 <w:color w:val="000000"/>
                 <w:sz w:val="17"/>
               </w:rPr>
-              <w:t>20%</w:t>
+              <w:t>25%</w:t>
             </w:r>
           </w:p>
         </w:tc>
@@ -1040,7 +978,7 @@
                 <w:color w:val="000000"/>
                 <w:sz w:val="17"/>
               </w:rPr>
-              <w:t>20%</w:t>
+              <w:t>25%</w:t>
             </w:r>
           </w:p>
         </w:tc>
@@ -1140,7 +1078,7 @@
                 <w:color w:val="000000"/>
                 <w:sz w:val="17"/>
               </w:rPr>
-              <w:t>20%</w:t>
+              <w:t>25%</w:t>
             </w:r>
           </w:p>
         </w:tc>
@@ -1216,105 +1154,6 @@
                 <w:color w:val="000000"/>
                 <w:sz w:val="17"/>
               </w:rPr>
-              <w:t>Scalability Ceiling</w:t>
-            </w:r>
-          </w:p>
-        </w:tc>
-        <w:tc>
-          <w:tcPr>
-            <w:tcW w:type="dxa" w:w="1152"/>
-            <w:tcMar>
-              <w:top w:w="30" w:type="dxa"/>
-              <w:bottom w:w="30" w:type="dxa"/>
-              <w:left w:w="50" w:type="dxa"/>
-              <w:right w:w="50" w:type="dxa"/>
-            </w:tcMar>
-          </w:tcPr>
-          <w:p>
-            <w:pPr>
-              <w:spacing w:before="20" w:after="20" w:line="252" w:lineRule="auto"/>
-            </w:pPr>
-            <w:r>
-              <w:rPr>
-                <w:rFonts w:ascii="Times New Roman" w:hAnsi="Times New Roman"/>
-                <w:color w:val="000000"/>
-                <w:sz w:val="17"/>
-              </w:rPr>
-              <w:t>15%</w:t>
-            </w:r>
-          </w:p>
-        </w:tc>
-        <w:tc>
-          <w:tcPr>
-            <w:tcW w:type="dxa" w:w="2880"/>
-            <w:tcMar>
-              <w:top w:w="30" w:type="dxa"/>
-              <w:bottom w:w="30" w:type="dxa"/>
-              <w:left w:w="50" w:type="dxa"/>
-              <w:right w:w="50" w:type="dxa"/>
-            </w:tcMar>
-          </w:tcPr>
-          <w:p>
-            <w:pPr>
-              <w:spacing w:before="20" w:after="20" w:line="252" w:lineRule="auto"/>
-            </w:pPr>
-            <w:r>
-              <w:rPr>
-                <w:rFonts w:ascii="Times New Roman" w:hAnsi="Times New Roman"/>
-                <w:color w:val="000000"/>
-                <w:sz w:val="17"/>
-              </w:rPr>
-              <w:t>8 / 10 (Sufficient for communities)</w:t>
-            </w:r>
-          </w:p>
-        </w:tc>
-        <w:tc>
-          <w:tcPr>
-            <w:tcW w:type="dxa" w:w="2736"/>
-            <w:tcMar>
-              <w:top w:w="30" w:type="dxa"/>
-              <w:bottom w:w="30" w:type="dxa"/>
-              <w:left w:w="50" w:type="dxa"/>
-              <w:right w:w="50" w:type="dxa"/>
-            </w:tcMar>
-          </w:tcPr>
-          <w:p>
-            <w:pPr>
-              <w:spacing w:before="20" w:after="20" w:line="252" w:lineRule="auto"/>
-            </w:pPr>
-            <w:r>
-              <w:rPr>
-                <w:rFonts w:ascii="Times New Roman" w:hAnsi="Times New Roman"/>
-                <w:color w:val="000000"/>
-                <w:sz w:val="17"/>
-              </w:rPr>
-              <w:t>10 / 10 (Hyperscale enterprise)</w:t>
-            </w:r>
-          </w:p>
-        </w:tc>
-      </w:tr>
-      <w:tr>
-        <w:tc>
-          <w:tcPr>
-            <w:tcW w:type="dxa" w:w="2592"/>
-            <w:shd w:fill="F8FAFC"/>
-            <w:tcMar>
-              <w:top w:w="30" w:type="dxa"/>
-              <w:bottom w:w="30" w:type="dxa"/>
-              <w:left w:w="50" w:type="dxa"/>
-              <w:right w:w="50" w:type="dxa"/>
-            </w:tcMar>
-          </w:tcPr>
-          <w:p>
-            <w:pPr>
-              <w:spacing w:before="20" w:after="20" w:line="252" w:lineRule="auto"/>
-            </w:pPr>
-            <w:r>
-              <w:rPr>
-                <w:rFonts w:ascii="Times New Roman" w:hAnsi="Times New Roman"/>
-                <w:color w:val="000000"/>
-                <w:sz w:val="17"/>
-              </w:rPr>
               <w:t>Weighted Final Score</w:t>
             </w:r>
           </w:p>
@@ -1322,7 +1161,6 @@
         <w:tc>
           <w:tcPr>
             <w:tcW w:type="dxa" w:w="1152"/>
-            <w:shd w:fill="F8FAFC"/>
             <w:tcMar>
               <w:top w:w="30" w:type="dxa"/>
               <w:bottom w:w="30" w:type="dxa"/>
@@ -1347,7 +1185,6 @@
         <w:tc>
           <w:tcPr>
             <w:tcW w:type="dxa" w:w="2880"/>
-            <w:shd w:fill="F8FAFC"/>
             <w:tcMar>
               <w:top w:w="30" w:type="dxa"/>
               <w:bottom w:w="30" w:type="dxa"/>
@@ -1365,14 +1202,13 @@
                 <w:color w:val="000000"/>
                 <w:sz w:val="17"/>
               </w:rPr>
-              <w:t>9.4 / 10.0 (WINNER)</w:t>
+              <w:t>9.75 / 10.0 (SELECTED)</w:t>
             </w:r>
           </w:p>
         </w:tc>
         <w:tc>
           <w:tcPr>
             <w:tcW w:type="dxa" w:w="2736"/>
-            <w:shd w:fill="F8FAFC"/>
             <w:tcMar>
               <w:top w:w="30" w:type="dxa"/>
               <w:bottom w:w="30" w:type="dxa"/>
@@ -1390,7 +1226,7 @@
                 <w:color w:val="000000"/>
                 <w:sz w:val="17"/>
               </w:rPr>
-              <w:t>5.5 / 10.0</w:t>
+              <w:t>4.75 / 10.0</w:t>
             </w:r>
           </w:p>
         </w:tc>
@@ -1422,36 +1258,7 @@
           <w:color w:val="000000"/>
           <w:sz w:val="24"/>
         </w:rPr>
-        <w:t>The database design defines the persistent data structures, table schemas, normalization integrity, and relationship constraints required to support concurrent lending transactions.</w:t>
-      </w:r>
-    </w:p>
-    <w:p>
-      <w:pPr>
-        <w:keepNext/>
-        <w:spacing w:before="140" w:after="40" w:line="288" w:lineRule="auto"/>
-      </w:pPr>
-      <w:r>
-        <w:rPr>
-          <w:rFonts w:ascii="Times New Roman" w:hAnsi="Times New Roman"/>
-          <w:b/>
-          <w:color w:val="000000"/>
-          <w:sz w:val="26"/>
-        </w:rPr>
-        <w:t>2.1 Database Management System Selection</w:t>
-      </w:r>
-    </w:p>
-    <w:p>
-      <w:pPr>
-        <w:spacing w:line="360" w:lineRule="auto" w:after="80"/>
-        <w:jc w:val="both"/>
-      </w:pPr>
-      <w:r>
-        <w:rPr>
-          <w:rFonts w:ascii="Times New Roman" w:hAnsi="Times New Roman"/>
-          <w:color w:val="000000"/>
-          <w:sz w:val="24"/>
-        </w:rPr>
-        <w:t>The platform employs a relational database architecture powered by MySQL 8.0 and hosted on TiDB Serverless Cloud. A relational DBMS was selected over NoSQL (MongoDB) because community resource sharing strictly demands ACID transaction guarantees and foreign key constraints to prevent orphaned loans.</w:t>
+        <w:t>The database tier uses MySQL 8.0 deployed on TiDB Serverless Cloud. A relational DBMS was selected over NoSQL for strict ACID transaction consistency and foreign key constraints.</w:t>
       </w:r>
     </w:p>
     <w:p>
@@ -1463,7 +1270,7 @@
       <w:r>
         <w:drawing>
           <wp:inline xmlns:a="http://schemas.openxmlformats.org/drawingml/2006/main" xmlns:pic="http://schemas.openxmlformats.org/drawingml/2006/picture">
-            <wp:extent cx="4297680" cy="2464472"/>
+            <wp:extent cx="4023360" cy="2243635"/>
             <wp:docPr id="6" name="Picture 6"/>
             <wp:cNvGraphicFramePr>
               <a:graphicFrameLocks noChangeAspect="1"/>
@@ -1484,7 +1291,7 @@
                   <pic:spPr>
                     <a:xfrm>
                       <a:off x="0" y="0"/>
-                      <a:ext cx="4297680" cy="2464472"/>
+                      <a:ext cx="4023360" cy="2243635"/>
                     </a:xfrm>
                     <a:prstGeom prst="rect"/>
                   </pic:spPr>
@@ -1522,7 +1329,7 @@
           <w:color w:val="000000"/>
           <w:sz w:val="24"/>
         </w:rPr>
-        <w:t>The Entity-Relationship Diagram (ERD) illustrates the relational structure among the three core database entities (`USERS`, `ITEMS`, and `LENDING_REQUESTS`). Primary keys (`PK`), foreign keys (`FK`), and 1:N cardinalities ensure structural consistency across users, listings, and transactions.</w:t>
+        <w:t>The ER Diagram illustrates the relational entities (`USERS`, `ITEMS`, `LENDING_REQUESTS`), primary keys, foreign keys, and 1:N cardinalities.</w:t>
       </w:r>
     </w:p>
     <w:p>
@@ -1537,7 +1344,7 @@
           <w:color w:val="000000"/>
           <w:sz w:val="26"/>
         </w:rPr>
-        <w:t>2.2 Schema Normalization (1NF, 2NF, 3NF)</w:t>
+        <w:t>2.1 Schema Normalization (1NF, 2NF, 3NF)</w:t>
       </w:r>
     </w:p>
     <w:p>
@@ -1553,7 +1360,7 @@
           <w:color w:val="000000"/>
           <w:sz w:val="24"/>
         </w:rPr>
-        <w:t xml:space="preserve">First Normal Form (1NF): </w:t>
+        <w:t xml:space="preserve">1NF: </w:t>
       </w:r>
       <w:r>
         <w:rPr>
@@ -1561,7 +1368,7 @@
           <w:color w:val="000000"/>
           <w:sz w:val="24"/>
         </w:rPr>
-        <w:t>All table columns contain atomic, indivisible values. Repeating groups are eliminated, and every row is uniquely identified by an auto-incrementing primary key (`id`).</w:t>
+        <w:t>All attributes contain atomic values; repeating groups are eliminated with primary keys (`id`).</w:t>
       </w:r>
     </w:p>
     <w:p>
@@ -1577,7 +1384,7 @@
           <w:color w:val="000000"/>
           <w:sz w:val="24"/>
         </w:rPr>
-        <w:t xml:space="preserve">Second Normal Form (2NF): </w:t>
+        <w:t xml:space="preserve">2NF: </w:t>
       </w:r>
       <w:r>
         <w:rPr>
@@ -1585,7 +1392,7 @@
           <w:color w:val="000000"/>
           <w:sz w:val="24"/>
         </w:rPr>
-        <w:t>The schema satisfies 1NF, and all non-key columns depend fully on the complete primary key. Surrogate single-column keys eliminate partial dependencies.</w:t>
+        <w:t>Satisfies 1NF with zero partial key dependencies; non-key columns depend on the whole primary key.</w:t>
       </w:r>
     </w:p>
     <w:p>
@@ -1601,7 +1408,7 @@
           <w:color w:val="000000"/>
           <w:sz w:val="24"/>
         </w:rPr>
-        <w:t xml:space="preserve">Third Normal Form (3NF): </w:t>
+        <w:t xml:space="preserve">3NF: </w:t>
       </w:r>
       <w:r>
         <w:rPr>
@@ -1609,7 +1416,7 @@
           <w:color w:val="000000"/>
           <w:sz w:val="24"/>
         </w:rPr>
-        <w:t>The schema satisfies 2NF and eliminates transitive dependencies. Non-key columns depend solely on the primary key, preventing duplicate owner data inside item listings.</w:t>
+        <w:t>Satisfies 2NF with zero transitive dependencies; non-key columns depend solely on the primary key.</w:t>
       </w:r>
     </w:p>
     <w:p>
@@ -1624,21 +1431,7 @@
           <w:color w:val="000000"/>
           <w:sz w:val="26"/>
         </w:rPr>
-        <w:t>2.3 Physical Data Dictionaries</w:t>
-      </w:r>
-    </w:p>
-    <w:p>
-      <w:pPr>
-        <w:spacing w:line="360" w:lineRule="auto" w:after="80"/>
-        <w:jc w:val="both"/>
-      </w:pPr>
-      <w:r>
-        <w:rPr>
-          <w:rFonts w:ascii="Times New Roman" w:hAnsi="Times New Roman"/>
-          <w:color w:val="000000"/>
-          <w:sz w:val="24"/>
-        </w:rPr>
-        <w:t>The physical schema specifications define column data types, constraints, and operational descriptions across all database tables:</w:t>
+        <w:t>2.2 Physical Data Dictionaries</w:t>
       </w:r>
     </w:p>
     <w:p>
@@ -1681,7 +1474,7 @@
       <w:tr>
         <w:tc>
           <w:tcPr>
-            <w:tcW w:type="dxa" w:w="1584"/>
+            <w:tcW w:type="dxa" w:w="1440"/>
             <w:shd w:fill="E2E8F0"/>
             <w:tcMar>
               <w:top w:w="40" w:type="dxa"/>
@@ -1701,7 +1494,7 @@
                 <w:color w:val="000000"/>
                 <w:sz w:val="18"/>
               </w:rPr>
-              <w:t>Column Name</w:t>
+              <w:t>Field Name</w:t>
             </w:r>
           </w:p>
         </w:tc>
@@ -1759,7 +1552,7 @@
         </w:tc>
         <w:tc>
           <w:tcPr>
-            <w:tcW w:type="dxa" w:w="1152"/>
+            <w:tcW w:type="dxa" w:w="1296"/>
             <w:shd w:fill="E2E8F0"/>
             <w:tcMar>
               <w:top w:w="40" w:type="dxa"/>
@@ -1813,7 +1606,7 @@
       <w:tr>
         <w:tc>
           <w:tcPr>
-            <w:tcW w:type="dxa" w:w="1584"/>
+            <w:tcW w:type="dxa" w:w="1440"/>
             <w:tcMar>
               <w:top w:w="30" w:type="dxa"/>
               <w:bottom w:w="30" w:type="dxa"/>
@@ -1885,7 +1678,7 @@
         </w:tc>
         <w:tc>
           <w:tcPr>
-            <w:tcW w:type="dxa" w:w="1152"/>
+            <w:tcW w:type="dxa" w:w="1296"/>
             <w:tcMar>
               <w:top w:w="30" w:type="dxa"/>
               <w:bottom w:w="30" w:type="dxa"/>
@@ -1935,7 +1728,7 @@
       <w:tr>
         <w:tc>
           <w:tcPr>
-            <w:tcW w:type="dxa" w:w="1584"/>
+            <w:tcW w:type="dxa" w:w="1440"/>
             <w:shd w:fill="F8FAFC"/>
             <w:tcMar>
               <w:top w:w="30" w:type="dxa"/>
@@ -2010,7 +1803,7 @@
         </w:tc>
         <w:tc>
           <w:tcPr>
-            <w:tcW w:type="dxa" w:w="1152"/>
+            <w:tcW w:type="dxa" w:w="1296"/>
             <w:shd w:fill="F8FAFC"/>
             <w:tcMar>
               <w:top w:w="30" w:type="dxa"/>
@@ -2054,7 +1847,7 @@
                 <w:color w:val="000000"/>
                 <w:sz w:val="17"/>
               </w:rPr>
-              <w:t>Full name of the user</w:t>
+              <w:t>Full name of user</w:t>
             </w:r>
           </w:p>
         </w:tc>
@@ -2062,7 +1855,7 @@
       <w:tr>
         <w:tc>
           <w:tcPr>
-            <w:tcW w:type="dxa" w:w="1584"/>
+            <w:tcW w:type="dxa" w:w="1440"/>
             <w:tcMar>
               <w:top w:w="30" w:type="dxa"/>
               <w:bottom w:w="30" w:type="dxa"/>
@@ -2134,7 +1927,7 @@
         </w:tc>
         <w:tc>
           <w:tcPr>
-            <w:tcW w:type="dxa" w:w="1152"/>
+            <w:tcW w:type="dxa" w:w="1296"/>
             <w:tcMar>
               <w:top w:w="30" w:type="dxa"/>
               <w:bottom w:w="30" w:type="dxa"/>
@@ -2184,7 +1977,7 @@
       <w:tr>
         <w:tc>
           <w:tcPr>
-            <w:tcW w:type="dxa" w:w="1584"/>
+            <w:tcW w:type="dxa" w:w="1440"/>
             <w:shd w:fill="F8FAFC"/>
             <w:tcMar>
               <w:top w:w="30" w:type="dxa"/>
@@ -2259,7 +2052,7 @@
         </w:tc>
         <w:tc>
           <w:tcPr>
-            <w:tcW w:type="dxa" w:w="1152"/>
+            <w:tcW w:type="dxa" w:w="1296"/>
             <w:shd w:fill="F8FAFC"/>
             <w:tcMar>
               <w:top w:w="30" w:type="dxa"/>
@@ -2303,7 +2096,7 @@
                 <w:color w:val="000000"/>
                 <w:sz w:val="17"/>
               </w:rPr>
-              <w:t>Salted PBKDF2:SHA256 hash</w:t>
+              <w:t>PBKDF2:SHA256 password hash</w:t>
             </w:r>
           </w:p>
         </w:tc>
@@ -2311,7 +2104,7 @@
       <w:tr>
         <w:tc>
           <w:tcPr>
-            <w:tcW w:type="dxa" w:w="1584"/>
+            <w:tcW w:type="dxa" w:w="1440"/>
             <w:tcMar>
               <w:top w:w="30" w:type="dxa"/>
               <w:bottom w:w="30" w:type="dxa"/>
@@ -2383,7 +2176,7 @@
         </w:tc>
         <w:tc>
           <w:tcPr>
-            <w:tcW w:type="dxa" w:w="1152"/>
+            <w:tcW w:type="dxa" w:w="1296"/>
             <w:tcMar>
               <w:top w:w="30" w:type="dxa"/>
               <w:bottom w:w="30" w:type="dxa"/>
@@ -2433,7 +2226,7 @@
       <w:tr>
         <w:tc>
           <w:tcPr>
-            <w:tcW w:type="dxa" w:w="1584"/>
+            <w:tcW w:type="dxa" w:w="1440"/>
             <w:shd w:fill="F8FAFC"/>
             <w:tcMar>
               <w:top w:w="30" w:type="dxa"/>
@@ -2452,7 +2245,7 @@
                 <w:color w:val="000000"/>
                 <w:sz w:val="17"/>
               </w:rPr>
-              <w:t>address</w:t>
+              <w:t>created_at</w:t>
             </w:r>
           </w:p>
         </w:tc>
@@ -2477,7 +2270,7 @@
                 <w:color w:val="000000"/>
                 <w:sz w:val="17"/>
               </w:rPr>
-              <w:t>TEXT</w:t>
+              <w:t>TIMESTAMP</w:t>
             </w:r>
           </w:p>
         </w:tc>
@@ -2502,13 +2295,13 @@
                 <w:color w:val="000000"/>
                 <w:sz w:val="17"/>
               </w:rPr>
-              <w:t>NULLABLE</w:t>
+              <w:t>NOT NULL</w:t>
             </w:r>
           </w:p>
         </w:tc>
         <w:tc>
           <w:tcPr>
-            <w:tcW w:type="dxa" w:w="1152"/>
+            <w:tcW w:type="dxa" w:w="1296"/>
             <w:shd w:fill="F8FAFC"/>
             <w:tcMar>
               <w:top w:w="30" w:type="dxa"/>
@@ -2527,7 +2320,7 @@
                 <w:color w:val="000000"/>
                 <w:sz w:val="17"/>
               </w:rPr>
-              <w:t>NULL</w:t>
+              <w:t>CURRENT_TIMESTAMP</w:t>
             </w:r>
           </w:p>
         </w:tc>
@@ -2552,129 +2345,7 @@
                 <w:color w:val="000000"/>
                 <w:sz w:val="17"/>
               </w:rPr>
-              <w:t>Community residential address</w:t>
-            </w:r>
-          </w:p>
-        </w:tc>
-      </w:tr>
-      <w:tr>
-        <w:tc>
-          <w:tcPr>
-            <w:tcW w:type="dxa" w:w="1584"/>
-            <w:tcMar>
-              <w:top w:w="30" w:type="dxa"/>
-              <w:bottom w:w="30" w:type="dxa"/>
-              <w:left w:w="50" w:type="dxa"/>
-              <w:right w:w="50" w:type="dxa"/>
-            </w:tcMar>
-          </w:tcPr>
-          <w:p>
-            <w:pPr>
-              <w:spacing w:before="20" w:after="20" w:line="252" w:lineRule="auto"/>
-            </w:pPr>
-            <w:r>
-              <w:rPr>
-                <w:rFonts w:ascii="Times New Roman" w:hAnsi="Times New Roman"/>
-                <w:color w:val="000000"/>
-                <w:sz w:val="17"/>
-              </w:rPr>
-              <w:t>created_at</w:t>
-            </w:r>
-          </w:p>
-        </w:tc>
-        <w:tc>
-          <w:tcPr>
-            <w:tcW w:type="dxa" w:w="1584"/>
-            <w:tcMar>
-              <w:top w:w="30" w:type="dxa"/>
-              <w:bottom w:w="30" w:type="dxa"/>
-              <w:left w:w="50" w:type="dxa"/>
-              <w:right w:w="50" w:type="dxa"/>
-            </w:tcMar>
-          </w:tcPr>
-          <w:p>
-            <w:pPr>
-              <w:spacing w:before="20" w:after="20" w:line="252" w:lineRule="auto"/>
-            </w:pPr>
-            <w:r>
-              <w:rPr>
-                <w:rFonts w:ascii="Times New Roman" w:hAnsi="Times New Roman"/>
-                <w:color w:val="000000"/>
-                <w:sz w:val="17"/>
-              </w:rPr>
-              <w:t>TIMESTAMP</w:t>
-            </w:r>
-          </w:p>
-        </w:tc>
-        <w:tc>
-          <w:tcPr>
-            <w:tcW w:type="dxa" w:w="2160"/>
-            <w:tcMar>
-              <w:top w:w="30" w:type="dxa"/>
-              <w:bottom w:w="30" w:type="dxa"/>
-              <w:left w:w="50" w:type="dxa"/>
-              <w:right w:w="50" w:type="dxa"/>
-            </w:tcMar>
-          </w:tcPr>
-          <w:p>
-            <w:pPr>
-              <w:spacing w:before="20" w:after="20" w:line="252" w:lineRule="auto"/>
-            </w:pPr>
-            <w:r>
-              <w:rPr>
-                <w:rFonts w:ascii="Times New Roman" w:hAnsi="Times New Roman"/>
-                <w:color w:val="000000"/>
-                <w:sz w:val="17"/>
-              </w:rPr>
-              <w:t>NOT NULL</w:t>
-            </w:r>
-          </w:p>
-        </w:tc>
-        <w:tc>
-          <w:tcPr>
-            <w:tcW w:type="dxa" w:w="1152"/>
-            <w:tcMar>
-              <w:top w:w="30" w:type="dxa"/>
-              <w:bottom w:w="30" w:type="dxa"/>
-              <w:left w:w="50" w:type="dxa"/>
-              <w:right w:w="50" w:type="dxa"/>
-            </w:tcMar>
-          </w:tcPr>
-          <w:p>
-            <w:pPr>
-              <w:spacing w:before="20" w:after="20" w:line="252" w:lineRule="auto"/>
-            </w:pPr>
-            <w:r>
-              <w:rPr>
-                <w:rFonts w:ascii="Times New Roman" w:hAnsi="Times New Roman"/>
-                <w:color w:val="000000"/>
-                <w:sz w:val="17"/>
-              </w:rPr>
-              <w:t>CURRENT_TIMESTAMP</w:t>
-            </w:r>
-          </w:p>
-        </w:tc>
-        <w:tc>
-          <w:tcPr>
-            <w:tcW w:type="dxa" w:w="2880"/>
-            <w:tcMar>
-              <w:top w:w="30" w:type="dxa"/>
-              <w:bottom w:w="30" w:type="dxa"/>
-              <w:left w:w="50" w:type="dxa"/>
-              <w:right w:w="50" w:type="dxa"/>
-            </w:tcMar>
-          </w:tcPr>
-          <w:p>
-            <w:pPr>
-              <w:spacing w:before="20" w:after="20" w:line="252" w:lineRule="auto"/>
-            </w:pPr>
-            <w:r>
-              <w:rPr>
-                <w:rFonts w:ascii="Times New Roman" w:hAnsi="Times New Roman"/>
-                <w:color w:val="000000"/>
-                <w:sz w:val="17"/>
-              </w:rPr>
-              <w:t>Account creation timestamp</w:t>
+              <w:t>Creation timestamp</w:t>
             </w:r>
           </w:p>
         </w:tc>
@@ -2720,7 +2391,7 @@
       <w:tr>
         <w:tc>
           <w:tcPr>
-            <w:tcW w:type="dxa" w:w="1584"/>
+            <w:tcW w:type="dxa" w:w="1440"/>
             <w:shd w:fill="E2E8F0"/>
             <w:tcMar>
               <w:top w:w="40" w:type="dxa"/>
@@ -2740,7 +2411,7 @@
                 <w:color w:val="000000"/>
                 <w:sz w:val="18"/>
               </w:rPr>
-              <w:t>Column Name</w:t>
+              <w:t>Field Name</w:t>
             </w:r>
           </w:p>
         </w:tc>
@@ -2798,7 +2469,7 @@
         </w:tc>
         <w:tc>
           <w:tcPr>
-            <w:tcW w:type="dxa" w:w="1152"/>
+            <w:tcW w:type="dxa" w:w="1296"/>
             <w:shd w:fill="E2E8F0"/>
             <w:tcMar>
               <w:top w:w="40" w:type="dxa"/>
@@ -2852,7 +2523,7 @@
       <w:tr>
         <w:tc>
           <w:tcPr>
-            <w:tcW w:type="dxa" w:w="1584"/>
+            <w:tcW w:type="dxa" w:w="1440"/>
             <w:tcMar>
               <w:top w:w="30" w:type="dxa"/>
               <w:bottom w:w="30" w:type="dxa"/>
@@ -2924,7 +2595,7 @@
         </w:tc>
         <w:tc>
           <w:tcPr>
-            <w:tcW w:type="dxa" w:w="1152"/>
+            <w:tcW w:type="dxa" w:w="1296"/>
             <w:tcMar>
               <w:top w:w="30" w:type="dxa"/>
               <w:bottom w:w="30" w:type="dxa"/>
@@ -2966,7 +2637,7 @@
                 <w:color w:val="000000"/>
                 <w:sz w:val="17"/>
               </w:rPr>
-              <w:t>Unique resource listing ID</w:t>
+              <w:t>Unique item listing ID</w:t>
             </w:r>
           </w:p>
         </w:tc>
@@ -2974,7 +2645,7 @@
       <w:tr>
         <w:tc>
           <w:tcPr>
-            <w:tcW w:type="dxa" w:w="1584"/>
+            <w:tcW w:type="dxa" w:w="1440"/>
             <w:shd w:fill="F8FAFC"/>
             <w:tcMar>
               <w:top w:w="30" w:type="dxa"/>
@@ -3049,7 +2720,7 @@
         </w:tc>
         <w:tc>
           <w:tcPr>
-            <w:tcW w:type="dxa" w:w="1152"/>
+            <w:tcW w:type="dxa" w:w="1296"/>
             <w:shd w:fill="F8FAFC"/>
             <w:tcMar>
               <w:top w:w="30" w:type="dxa"/>
@@ -3093,7 +2764,7 @@
                 <w:color w:val="000000"/>
                 <w:sz w:val="17"/>
               </w:rPr>
-              <w:t>References the item owner</w:t>
+              <w:t>References item owner</w:t>
             </w:r>
           </w:p>
         </w:tc>
@@ -3101,7 +2772,7 @@
       <w:tr>
         <w:tc>
           <w:tcPr>
-            <w:tcW w:type="dxa" w:w="1584"/>
+            <w:tcW w:type="dxa" w:w="1440"/>
             <w:tcMar>
               <w:top w:w="30" w:type="dxa"/>
               <w:bottom w:w="30" w:type="dxa"/>
@@ -3173,7 +2844,7 @@
         </w:tc>
         <w:tc>
           <w:tcPr>
-            <w:tcW w:type="dxa" w:w="1152"/>
+            <w:tcW w:type="dxa" w:w="1296"/>
             <w:tcMar>
               <w:top w:w="30" w:type="dxa"/>
               <w:bottom w:w="30" w:type="dxa"/>
@@ -3215,7 +2886,7 @@
                 <w:color w:val="000000"/>
                 <w:sz w:val="17"/>
               </w:rPr>
-              <w:t>Title of the listed item</w:t>
+              <w:t>Title of listed item</w:t>
             </w:r>
           </w:p>
         </w:tc>
@@ -3223,7 +2894,7 @@
       <w:tr>
         <w:tc>
           <w:tcPr>
-            <w:tcW w:type="dxa" w:w="1584"/>
+            <w:tcW w:type="dxa" w:w="1440"/>
             <w:shd w:fill="F8FAFC"/>
             <w:tcMar>
               <w:top w:w="30" w:type="dxa"/>
@@ -3298,7 +2969,7 @@
         </w:tc>
         <w:tc>
           <w:tcPr>
-            <w:tcW w:type="dxa" w:w="1152"/>
+            <w:tcW w:type="dxa" w:w="1296"/>
             <w:shd w:fill="F8FAFC"/>
             <w:tcMar>
               <w:top w:w="30" w:type="dxa"/>
@@ -3342,7 +3013,7 @@
                 <w:color w:val="000000"/>
                 <w:sz w:val="17"/>
               </w:rPr>
-              <w:t>Classification (Tools, Kitchen, etc.)</w:t>
+              <w:t>Resource category</w:t>
             </w:r>
           </w:p>
         </w:tc>
@@ -3350,7 +3021,7 @@
       <w:tr>
         <w:tc>
           <w:tcPr>
-            <w:tcW w:type="dxa" w:w="1584"/>
+            <w:tcW w:type="dxa" w:w="1440"/>
             <w:tcMar>
               <w:top w:w="30" w:type="dxa"/>
               <w:bottom w:w="30" w:type="dxa"/>
@@ -3368,7 +3039,7 @@
                 <w:color w:val="000000"/>
                 <w:sz w:val="17"/>
               </w:rPr>
-              <w:t>description</w:t>
+              <w:t>image</w:t>
             </w:r>
           </w:p>
         </w:tc>
@@ -3392,7 +3063,7 @@
                 <w:color w:val="000000"/>
                 <w:sz w:val="17"/>
               </w:rPr>
-              <w:t>TEXT</w:t>
+              <w:t>VARCHAR(255)</w:t>
             </w:r>
           </w:p>
         </w:tc>
@@ -3422,7 +3093,7 @@
         </w:tc>
         <w:tc>
           <w:tcPr>
-            <w:tcW w:type="dxa" w:w="1152"/>
+            <w:tcW w:type="dxa" w:w="1296"/>
             <w:tcMar>
               <w:top w:w="30" w:type="dxa"/>
               <w:bottom w:w="30" w:type="dxa"/>
@@ -3464,7 +3135,7 @@
                 <w:color w:val="000000"/>
                 <w:sz w:val="17"/>
               </w:rPr>
-              <w:t>Usage guidelines and condition</w:t>
+              <w:t>UUID image filename on disk</w:t>
             </w:r>
           </w:p>
         </w:tc>
@@ -3472,7 +3143,7 @@
       <w:tr>
         <w:tc>
           <w:tcPr>
-            <w:tcW w:type="dxa" w:w="1584"/>
+            <w:tcW w:type="dxa" w:w="1440"/>
             <w:shd w:fill="F8FAFC"/>
             <w:tcMar>
               <w:top w:w="30" w:type="dxa"/>
@@ -3491,7 +3162,7 @@
                 <w:color w:val="000000"/>
                 <w:sz w:val="17"/>
               </w:rPr>
-              <w:t>image</w:t>
+              <w:t>availability</w:t>
             </w:r>
           </w:p>
         </w:tc>
@@ -3516,256 +3187,7 @@
                 <w:color w:val="000000"/>
                 <w:sz w:val="17"/>
               </w:rPr>
-              <w:t>VARCHAR(255)</w:t>
-            </w:r>
-          </w:p>
-        </w:tc>
-        <w:tc>
-          <w:tcPr>
-            <w:tcW w:type="dxa" w:w="2160"/>
-            <w:shd w:fill="F8FAFC"/>
-            <w:tcMar>
-              <w:top w:w="30" w:type="dxa"/>
-              <w:bottom w:w="30" w:type="dxa"/>
-              <w:left w:w="50" w:type="dxa"/>
-              <w:right w:w="50" w:type="dxa"/>
-            </w:tcMar>
-          </w:tcPr>
-          <w:p>
-            <w:pPr>
-              <w:spacing w:before="20" w:after="20" w:line="252" w:lineRule="auto"/>
-            </w:pPr>
-            <w:r>
-              <w:rPr>
-                <w:rFonts w:ascii="Times New Roman" w:hAnsi="Times New Roman"/>
-                <w:color w:val="000000"/>
-                <w:sz w:val="17"/>
-              </w:rPr>
-              <w:t>NULLABLE</w:t>
-            </w:r>
-          </w:p>
-        </w:tc>
-        <w:tc>
-          <w:tcPr>
-            <w:tcW w:type="dxa" w:w="1152"/>
-            <w:shd w:fill="F8FAFC"/>
-            <w:tcMar>
-              <w:top w:w="30" w:type="dxa"/>
-              <w:bottom w:w="30" w:type="dxa"/>
-              <w:left w:w="50" w:type="dxa"/>
-              <w:right w:w="50" w:type="dxa"/>
-            </w:tcMar>
-          </w:tcPr>
-          <w:p>
-            <w:pPr>
-              <w:spacing w:before="20" w:after="20" w:line="252" w:lineRule="auto"/>
-            </w:pPr>
-            <w:r>
-              <w:rPr>
-                <w:rFonts w:ascii="Times New Roman" w:hAnsi="Times New Roman"/>
-                <w:color w:val="000000"/>
-                <w:sz w:val="17"/>
-              </w:rPr>
-              <w:t>NULL</w:t>
-            </w:r>
-          </w:p>
-        </w:tc>
-        <w:tc>
-          <w:tcPr>
-            <w:tcW w:type="dxa" w:w="2880"/>
-            <w:shd w:fill="F8FAFC"/>
-            <w:tcMar>
-              <w:top w:w="30" w:type="dxa"/>
-              <w:bottom w:w="30" w:type="dxa"/>
-              <w:left w:w="50" w:type="dxa"/>
-              <w:right w:w="50" w:type="dxa"/>
-            </w:tcMar>
-          </w:tcPr>
-          <w:p>
-            <w:pPr>
-              <w:spacing w:before="20" w:after="20" w:line="252" w:lineRule="auto"/>
-            </w:pPr>
-            <w:r>
-              <w:rPr>
-                <w:rFonts w:ascii="Times New Roman" w:hAnsi="Times New Roman"/>
-                <w:color w:val="000000"/>
-                <w:sz w:val="17"/>
-              </w:rPr>
-              <w:t>UUID image filename on server disk</w:t>
-            </w:r>
-          </w:p>
-        </w:tc>
-      </w:tr>
-      <w:tr>
-        <w:tc>
-          <w:tcPr>
-            <w:tcW w:type="dxa" w:w="1584"/>
-            <w:tcMar>
-              <w:top w:w="30" w:type="dxa"/>
-              <w:bottom w:w="30" w:type="dxa"/>
-              <w:left w:w="50" w:type="dxa"/>
-              <w:right w:w="50" w:type="dxa"/>
-            </w:tcMar>
-          </w:tcPr>
-          <w:p>
-            <w:pPr>
-              <w:spacing w:before="20" w:after="20" w:line="252" w:lineRule="auto"/>
-            </w:pPr>
-            <w:r>
-              <w:rPr>
-                <w:rFonts w:ascii="Times New Roman" w:hAnsi="Times New Roman"/>
-                <w:color w:val="000000"/>
-                <w:sz w:val="17"/>
-              </w:rPr>
-              <w:t>availability</w:t>
-            </w:r>
-          </w:p>
-        </w:tc>
-        <w:tc>
-          <w:tcPr>
-            <w:tcW w:type="dxa" w:w="1584"/>
-            <w:tcMar>
-              <w:top w:w="30" w:type="dxa"/>
-              <w:bottom w:w="30" w:type="dxa"/>
-              <w:left w:w="50" w:type="dxa"/>
-              <w:right w:w="50" w:type="dxa"/>
-            </w:tcMar>
-          </w:tcPr>
-          <w:p>
-            <w:pPr>
-              <w:spacing w:before="20" w:after="20" w:line="252" w:lineRule="auto"/>
-            </w:pPr>
-            <w:r>
-              <w:rPr>
-                <w:rFonts w:ascii="Times New Roman" w:hAnsi="Times New Roman"/>
-                <w:color w:val="000000"/>
-                <w:sz w:val="17"/>
-              </w:rPr>
               <w:t>ENUM</w:t>
-            </w:r>
-          </w:p>
-        </w:tc>
-        <w:tc>
-          <w:tcPr>
-            <w:tcW w:type="dxa" w:w="2160"/>
-            <w:tcMar>
-              <w:top w:w="30" w:type="dxa"/>
-              <w:bottom w:w="30" w:type="dxa"/>
-              <w:left w:w="50" w:type="dxa"/>
-              <w:right w:w="50" w:type="dxa"/>
-            </w:tcMar>
-          </w:tcPr>
-          <w:p>
-            <w:pPr>
-              <w:spacing w:before="20" w:after="20" w:line="252" w:lineRule="auto"/>
-            </w:pPr>
-            <w:r>
-              <w:rPr>
-                <w:rFonts w:ascii="Times New Roman" w:hAnsi="Times New Roman"/>
-                <w:color w:val="000000"/>
-                <w:sz w:val="17"/>
-              </w:rPr>
-              <w:t>NOT NULL</w:t>
-            </w:r>
-          </w:p>
-        </w:tc>
-        <w:tc>
-          <w:tcPr>
-            <w:tcW w:type="dxa" w:w="1152"/>
-            <w:tcMar>
-              <w:top w:w="30" w:type="dxa"/>
-              <w:bottom w:w="30" w:type="dxa"/>
-              <w:left w:w="50" w:type="dxa"/>
-              <w:right w:w="50" w:type="dxa"/>
-            </w:tcMar>
-          </w:tcPr>
-          <w:p>
-            <w:pPr>
-              <w:spacing w:before="20" w:after="20" w:line="252" w:lineRule="auto"/>
-            </w:pPr>
-            <w:r>
-              <w:rPr>
-                <w:rFonts w:ascii="Times New Roman" w:hAnsi="Times New Roman"/>
-                <w:color w:val="000000"/>
-                <w:sz w:val="17"/>
-              </w:rPr>
-              <w:t>'Available'</w:t>
-            </w:r>
-          </w:p>
-        </w:tc>
-        <w:tc>
-          <w:tcPr>
-            <w:tcW w:type="dxa" w:w="2880"/>
-            <w:tcMar>
-              <w:top w:w="30" w:type="dxa"/>
-              <w:bottom w:w="30" w:type="dxa"/>
-              <w:left w:w="50" w:type="dxa"/>
-              <w:right w:w="50" w:type="dxa"/>
-            </w:tcMar>
-          </w:tcPr>
-          <w:p>
-            <w:pPr>
-              <w:spacing w:before="20" w:after="20" w:line="252" w:lineRule="auto"/>
-            </w:pPr>
-            <w:r>
-              <w:rPr>
-                <w:rFonts w:ascii="Times New Roman" w:hAnsi="Times New Roman"/>
-                <w:color w:val="000000"/>
-                <w:sz w:val="17"/>
-              </w:rPr>
-              <w:t>Status: 'Available' or 'Lent'</w:t>
-            </w:r>
-          </w:p>
-        </w:tc>
-      </w:tr>
-      <w:tr>
-        <w:tc>
-          <w:tcPr>
-            <w:tcW w:type="dxa" w:w="1584"/>
-            <w:shd w:fill="F8FAFC"/>
-            <w:tcMar>
-              <w:top w:w="30" w:type="dxa"/>
-              <w:bottom w:w="30" w:type="dxa"/>
-              <w:left w:w="50" w:type="dxa"/>
-              <w:right w:w="50" w:type="dxa"/>
-            </w:tcMar>
-          </w:tcPr>
-          <w:p>
-            <w:pPr>
-              <w:spacing w:before="20" w:after="20" w:line="252" w:lineRule="auto"/>
-            </w:pPr>
-            <w:r>
-              <w:rPr>
-                <w:rFonts w:ascii="Times New Roman" w:hAnsi="Times New Roman"/>
-                <w:color w:val="000000"/>
-                <w:sz w:val="17"/>
-              </w:rPr>
-              <w:t>created_at</w:t>
-            </w:r>
-          </w:p>
-        </w:tc>
-        <w:tc>
-          <w:tcPr>
-            <w:tcW w:type="dxa" w:w="1584"/>
-            <w:shd w:fill="F8FAFC"/>
-            <w:tcMar>
-              <w:top w:w="30" w:type="dxa"/>
-              <w:bottom w:w="30" w:type="dxa"/>
-              <w:left w:w="50" w:type="dxa"/>
-              <w:right w:w="50" w:type="dxa"/>
-            </w:tcMar>
-          </w:tcPr>
-          <w:p>
-            <w:pPr>
-              <w:spacing w:before="20" w:after="20" w:line="252" w:lineRule="auto"/>
-            </w:pPr>
-            <w:r>
-              <w:rPr>
-                <w:rFonts w:ascii="Times New Roman" w:hAnsi="Times New Roman"/>
-                <w:color w:val="000000"/>
-                <w:sz w:val="17"/>
-              </w:rPr>
-              <w:t>TIMESTAMP</w:t>
             </w:r>
           </w:p>
         </w:tc>
@@ -3796,8 +3218,131 @@
         </w:tc>
         <w:tc>
           <w:tcPr>
-            <w:tcW w:type="dxa" w:w="1152"/>
+            <w:tcW w:type="dxa" w:w="1296"/>
             <w:shd w:fill="F8FAFC"/>
+            <w:tcMar>
+              <w:top w:w="30" w:type="dxa"/>
+              <w:bottom w:w="30" w:type="dxa"/>
+              <w:left w:w="50" w:type="dxa"/>
+              <w:right w:w="50" w:type="dxa"/>
+            </w:tcMar>
+          </w:tcPr>
+          <w:p>
+            <w:pPr>
+              <w:spacing w:before="20" w:after="20" w:line="252" w:lineRule="auto"/>
+            </w:pPr>
+            <w:r>
+              <w:rPr>
+                <w:rFonts w:ascii="Times New Roman" w:hAnsi="Times New Roman"/>
+                <w:color w:val="000000"/>
+                <w:sz w:val="17"/>
+              </w:rPr>
+              <w:t>'Available'</w:t>
+            </w:r>
+          </w:p>
+        </w:tc>
+        <w:tc>
+          <w:tcPr>
+            <w:tcW w:type="dxa" w:w="2880"/>
+            <w:shd w:fill="F8FAFC"/>
+            <w:tcMar>
+              <w:top w:w="30" w:type="dxa"/>
+              <w:bottom w:w="30" w:type="dxa"/>
+              <w:left w:w="50" w:type="dxa"/>
+              <w:right w:w="50" w:type="dxa"/>
+            </w:tcMar>
+          </w:tcPr>
+          <w:p>
+            <w:pPr>
+              <w:spacing w:before="20" w:after="20" w:line="252" w:lineRule="auto"/>
+            </w:pPr>
+            <w:r>
+              <w:rPr>
+                <w:rFonts w:ascii="Times New Roman" w:hAnsi="Times New Roman"/>
+                <w:color w:val="000000"/>
+                <w:sz w:val="17"/>
+              </w:rPr>
+              <w:t>'Available' or 'Lent'</w:t>
+            </w:r>
+          </w:p>
+        </w:tc>
+      </w:tr>
+      <w:tr>
+        <w:tc>
+          <w:tcPr>
+            <w:tcW w:type="dxa" w:w="1440"/>
+            <w:tcMar>
+              <w:top w:w="30" w:type="dxa"/>
+              <w:bottom w:w="30" w:type="dxa"/>
+              <w:left w:w="50" w:type="dxa"/>
+              <w:right w:w="50" w:type="dxa"/>
+            </w:tcMar>
+          </w:tcPr>
+          <w:p>
+            <w:pPr>
+              <w:spacing w:before="20" w:after="20" w:line="252" w:lineRule="auto"/>
+            </w:pPr>
+            <w:r>
+              <w:rPr>
+                <w:rFonts w:ascii="Times New Roman" w:hAnsi="Times New Roman"/>
+                <w:color w:val="000000"/>
+                <w:sz w:val="17"/>
+              </w:rPr>
+              <w:t>created_at</w:t>
+            </w:r>
+          </w:p>
+        </w:tc>
+        <w:tc>
+          <w:tcPr>
+            <w:tcW w:type="dxa" w:w="1584"/>
+            <w:tcMar>
+              <w:top w:w="30" w:type="dxa"/>
+              <w:bottom w:w="30" w:type="dxa"/>
+              <w:left w:w="50" w:type="dxa"/>
+              <w:right w:w="50" w:type="dxa"/>
+            </w:tcMar>
+          </w:tcPr>
+          <w:p>
+            <w:pPr>
+              <w:spacing w:before="20" w:after="20" w:line="252" w:lineRule="auto"/>
+            </w:pPr>
+            <w:r>
+              <w:rPr>
+                <w:rFonts w:ascii="Times New Roman" w:hAnsi="Times New Roman"/>
+                <w:color w:val="000000"/>
+                <w:sz w:val="17"/>
+              </w:rPr>
+              <w:t>TIMESTAMP</w:t>
+            </w:r>
+          </w:p>
+        </w:tc>
+        <w:tc>
+          <w:tcPr>
+            <w:tcW w:type="dxa" w:w="2160"/>
+            <w:tcMar>
+              <w:top w:w="30" w:type="dxa"/>
+              <w:bottom w:w="30" w:type="dxa"/>
+              <w:left w:w="50" w:type="dxa"/>
+              <w:right w:w="50" w:type="dxa"/>
+            </w:tcMar>
+          </w:tcPr>
+          <w:p>
+            <w:pPr>
+              <w:spacing w:before="20" w:after="20" w:line="252" w:lineRule="auto"/>
+            </w:pPr>
+            <w:r>
+              <w:rPr>
+                <w:rFonts w:ascii="Times New Roman" w:hAnsi="Times New Roman"/>
+                <w:color w:val="000000"/>
+                <w:sz w:val="17"/>
+              </w:rPr>
+              <w:t>NOT NULL</w:t>
+            </w:r>
+          </w:p>
+        </w:tc>
+        <w:tc>
+          <w:tcPr>
+            <w:tcW w:type="dxa" w:w="1296"/>
             <w:tcMar>
               <w:top w:w="30" w:type="dxa"/>
               <w:bottom w:w="30" w:type="dxa"/>
@@ -3822,7 +3367,6 @@
         <w:tc>
           <w:tcPr>
             <w:tcW w:type="dxa" w:w="2880"/>
-            <w:shd w:fill="F8FAFC"/>
             <w:tcMar>
               <w:top w:w="30" w:type="dxa"/>
               <w:bottom w:w="30" w:type="dxa"/>
@@ -3840,7 +3384,7 @@
                 <w:color w:val="000000"/>
                 <w:sz w:val="17"/>
               </w:rPr>
-              <w:t>Listing creation timestamp</w:t>
+              <w:t>Creation timestamp</w:t>
             </w:r>
           </w:p>
         </w:tc>
@@ -3886,7 +3430,7 @@
       <w:tr>
         <w:tc>
           <w:tcPr>
-            <w:tcW w:type="dxa" w:w="1584"/>
+            <w:tcW w:type="dxa" w:w="1440"/>
             <w:shd w:fill="E2E8F0"/>
             <w:tcMar>
               <w:top w:w="40" w:type="dxa"/>
@@ -3906,7 +3450,7 @@
                 <w:color w:val="000000"/>
                 <w:sz w:val="18"/>
               </w:rPr>
-              <w:t>Column Name</w:t>
+              <w:t>Field Name</w:t>
             </w:r>
           </w:p>
         </w:tc>
@@ -3964,7 +3508,7 @@
         </w:tc>
         <w:tc>
           <w:tcPr>
-            <w:tcW w:type="dxa" w:w="1152"/>
+            <w:tcW w:type="dxa" w:w="1296"/>
             <w:shd w:fill="E2E8F0"/>
             <w:tcMar>
               <w:top w:w="40" w:type="dxa"/>
@@ -4018,7 +3562,7 @@
       <w:tr>
         <w:tc>
           <w:tcPr>
-            <w:tcW w:type="dxa" w:w="1584"/>
+            <w:tcW w:type="dxa" w:w="1440"/>
             <w:tcMar>
               <w:top w:w="30" w:type="dxa"/>
               <w:bottom w:w="30" w:type="dxa"/>
@@ -4090,7 +3634,7 @@
         </w:tc>
         <w:tc>
           <w:tcPr>
-            <w:tcW w:type="dxa" w:w="1152"/>
+            <w:tcW w:type="dxa" w:w="1296"/>
             <w:tcMar>
               <w:top w:w="30" w:type="dxa"/>
               <w:bottom w:w="30" w:type="dxa"/>
@@ -4140,7 +3684,7 @@
       <w:tr>
         <w:tc>
           <w:tcPr>
-            <w:tcW w:type="dxa" w:w="1584"/>
+            <w:tcW w:type="dxa" w:w="1440"/>
             <w:shd w:fill="F8FAFC"/>
             <w:tcMar>
               <w:top w:w="30" w:type="dxa"/>
@@ -4215,7 +3759,7 @@
         </w:tc>
         <w:tc>
           <w:tcPr>
-            <w:tcW w:type="dxa" w:w="1152"/>
+            <w:tcW w:type="dxa" w:w="1296"/>
             <w:shd w:fill="F8FAFC"/>
             <w:tcMar>
               <w:top w:w="30" w:type="dxa"/>
@@ -4267,7 +3811,7 @@
       <w:tr>
         <w:tc>
           <w:tcPr>
-            <w:tcW w:type="dxa" w:w="1584"/>
+            <w:tcW w:type="dxa" w:w="1440"/>
             <w:tcMar>
               <w:top w:w="30" w:type="dxa"/>
               <w:bottom w:w="30" w:type="dxa"/>
@@ -4339,7 +3883,7 @@
         </w:tc>
         <w:tc>
           <w:tcPr>
-            <w:tcW w:type="dxa" w:w="1152"/>
+            <w:tcW w:type="dxa" w:w="1296"/>
             <w:tcMar>
               <w:top w:w="30" w:type="dxa"/>
               <w:bottom w:w="30" w:type="dxa"/>
@@ -4381,7 +3925,7 @@
                 <w:color w:val="000000"/>
                 <w:sz w:val="17"/>
               </w:rPr>
-              <w:t>References requesting borrower</w:t>
+              <w:t>References borrowing user</w:t>
             </w:r>
           </w:p>
         </w:tc>
@@ -4389,7 +3933,7 @@
       <w:tr>
         <w:tc>
           <w:tcPr>
-            <w:tcW w:type="dxa" w:w="1584"/>
+            <w:tcW w:type="dxa" w:w="1440"/>
             <w:shd w:fill="F8FAFC"/>
             <w:tcMar>
               <w:top w:w="30" w:type="dxa"/>
@@ -4464,7 +4008,7 @@
         </w:tc>
         <w:tc>
           <w:tcPr>
-            <w:tcW w:type="dxa" w:w="1152"/>
+            <w:tcW w:type="dxa" w:w="1296"/>
             <w:shd w:fill="F8FAFC"/>
             <w:tcMar>
               <w:top w:w="30" w:type="dxa"/>
@@ -4516,7 +4060,7 @@
       <w:tr>
         <w:tc>
           <w:tcPr>
-            <w:tcW w:type="dxa" w:w="1584"/>
+            <w:tcW w:type="dxa" w:w="1440"/>
             <w:tcMar>
               <w:top w:w="30" w:type="dxa"/>
               <w:bottom w:w="30" w:type="dxa"/>
@@ -4588,7 +4132,7 @@
         </w:tc>
         <w:tc>
           <w:tcPr>
-            <w:tcW w:type="dxa" w:w="1152"/>
+            <w:tcW w:type="dxa" w:w="1296"/>
             <w:tcMar>
               <w:top w:w="30" w:type="dxa"/>
               <w:bottom w:w="30" w:type="dxa"/>
@@ -4630,7 +4174,7 @@
                 <w:color w:val="000000"/>
                 <w:sz w:val="17"/>
               </w:rPr>
-              <w:t>'Pending', 'Approved', 'Rejected', 'Returned'</w:t>
+              <w:t>'Pending','Approved','Rejected','Returned'</w:t>
             </w:r>
           </w:p>
         </w:tc>
@@ -4638,7 +4182,7 @@
       <w:tr>
         <w:tc>
           <w:tcPr>
-            <w:tcW w:type="dxa" w:w="1584"/>
+            <w:tcW w:type="dxa" w:w="1440"/>
             <w:shd w:fill="F8FAFC"/>
             <w:tcMar>
               <w:top w:w="30" w:type="dxa"/>
@@ -4713,7 +4257,7 @@
         </w:tc>
         <w:tc>
           <w:tcPr>
-            <w:tcW w:type="dxa" w:w="1152"/>
+            <w:tcW w:type="dxa" w:w="1296"/>
             <w:shd w:fill="F8FAFC"/>
             <w:tcMar>
               <w:top w:w="30" w:type="dxa"/>
@@ -4757,7 +4301,7 @@
                 <w:color w:val="000000"/>
                 <w:sz w:val="17"/>
               </w:rPr>
-              <w:t>Request submission timestamp</w:t>
+              <w:t>Request timestamp</w:t>
             </w:r>
           </w:p>
         </w:tc>
@@ -4775,7 +4319,7 @@
           <w:color w:val="000000"/>
           <w:sz w:val="26"/>
         </w:rPr>
-        <w:t>2.4 Database Performance, Security, and Integrity</w:t>
+        <w:t>2.3 Database Indexing, Integrity, and Security</w:t>
       </w:r>
     </w:p>
     <w:p>
@@ -4791,7 +4335,7 @@
           <w:color w:val="000000"/>
           <w:sz w:val="24"/>
         </w:rPr>
-        <w:t xml:space="preserve">B-Tree Indexing: </w:t>
+        <w:t xml:space="preserve">Indexing Strategy: </w:t>
       </w:r>
       <w:r>
         <w:rPr>
@@ -4799,7 +4343,7 @@
           <w:color w:val="000000"/>
           <w:sz w:val="24"/>
         </w:rPr>
-        <w:t>Primary keys use clustered indexes for rapid lookups. Foreign keys (`owner_id`, `borrower_id`, `item_id`) are indexed to optimize relational JOIN operations.</w:t>
+        <w:t>B-Tree primary key indexes provide O(1) lookups. Foreign keys (`owner_id`, `borrower_id`, `item_id`) are indexed to optimize relational JOIN performance.</w:t>
       </w:r>
     </w:p>
     <w:p>
@@ -4815,7 +4359,7 @@
           <w:color w:val="000000"/>
           <w:sz w:val="24"/>
         </w:rPr>
-        <w:t xml:space="preserve">Referential Integrity: </w:t>
+        <w:t xml:space="preserve">Security Controls: </w:t>
       </w:r>
       <w:r>
         <w:rPr>
@@ -4823,31 +4367,7 @@
           <w:color w:val="000000"/>
           <w:sz w:val="24"/>
         </w:rPr>
-        <w:t>Foreign key constraints enforced by the MySQL engine prevent dangling records and guarantee relational consistency.</w:t>
-      </w:r>
-    </w:p>
-    <w:p>
-      <w:pPr>
-        <w:pStyle w:val="ListBullet"/>
-        <w:spacing w:line="360" w:lineRule="auto" w:after="60"/>
-        <w:jc w:val="both"/>
-      </w:pPr>
-      <w:r>
-        <w:rPr>
-          <w:rFonts w:ascii="Times New Roman" w:hAnsi="Times New Roman"/>
-          <w:b/>
-          <w:color w:val="000000"/>
-          <w:sz w:val="24"/>
-        </w:rPr>
-        <w:t xml:space="preserve">Security &amp; Encryption: </w:t>
-      </w:r>
-      <w:r>
-        <w:rPr>
-          <w:rFonts w:ascii="Times New Roman" w:hAnsi="Times New Roman"/>
-          <w:color w:val="000000"/>
-          <w:sz w:val="24"/>
-        </w:rPr>
-        <w:t>Client-to-database connections use TLS 1.2+ encryption over port 4000. Parameterized SQL queries completely eliminate SQL injection threats.</w:t>
+        <w:t>All cloud database connections use TLS 1.2+ encryption over port 4000. Parameterized SQL queries completely eliminate SQL injection threats.</w:t>
       </w:r>
     </w:p>
     <w:sectPr>

</xml_diff>

<commit_message>
Add app screenshots, calibrate page counts to 17 pages total, and simplify content
</commit_message>
<xml_diff>
--- a/Second_Review_Documents/Topic1_Design.docx
+++ b/Second_Review_Documents/Topic1_Design.docx
@@ -58,7 +58,7 @@
           <w:color w:val="000000"/>
           <w:sz w:val="24"/>
         </w:rPr>
-        <w:t>The system design establishes the structural and behavioral architecture of the Community Lending Platform web application. The platform provides a neighborhood-level web portal enabling residents to share household items with low latency, high maintainability, and data security.</w:t>
+        <w:t>The system design defines the architecture and data flows of the Community Lending Platform. The platform provides an intuitive, neighborhood-level web application where community members can easily share household items, reduce waste, and borrow resources safely.</w:t>
       </w:r>
     </w:p>
     <w:p>
@@ -97,7 +97,7 @@
           <w:color w:val="000000"/>
           <w:sz w:val="24"/>
         </w:rPr>
-        <w:t>Responsive HTML5, CSS3, and JavaScript ES6+ rendering seamlessly across desktop, tablet, and mobile web browsers.</w:t>
+        <w:t>Built with responsive HTML5, CSS3, and JavaScript, ensuring smooth operation across desktop, tablet, and mobile web browsers.</w:t>
       </w:r>
     </w:p>
     <w:p>
@@ -121,7 +121,7 @@
           <w:color w:val="000000"/>
           <w:sz w:val="24"/>
         </w:rPr>
-        <w:t>Managed Gunicorn WSGI server on Render Cloud terminating TLS/SSL and routing incoming HTTP requests.</w:t>
+        <w:t>Managed by Gunicorn WSGI server on Render Cloud to handle incoming HTTPS requests and SSL termination.</w:t>
       </w:r>
     </w:p>
     <w:p>
@@ -145,7 +145,7 @@
           <w:color w:val="000000"/>
           <w:sz w:val="24"/>
         </w:rPr>
-        <w:t>Python Flask route handlers executing password hashing, session validation, file sanitization, and lending state transitions.</w:t>
+        <w:t>Python Flask controllers in `app.py` managing user login, password hashing, file uploads, and loan state transitions.</w:t>
       </w:r>
     </w:p>
     <w:p>
@@ -169,7 +169,7 @@
           <w:color w:val="000000"/>
           <w:sz w:val="24"/>
         </w:rPr>
-        <w:t>TiDB Serverless Cloud running MySQL 8.0 protocol for ACID relational storage, alongside static disk storage for uploaded photos.</w:t>
+        <w:t>TiDB Serverless Cloud relational database (MySQL 8.0 protocol) for ACID transactions, alongside disk storage for item photos.</w:t>
       </w:r>
     </w:p>
     <w:p>
@@ -198,7 +198,7 @@
           <w:color w:val="000000"/>
           <w:sz w:val="24"/>
         </w:rPr>
-        <w:t>Data Flow Diagrams model the movement, transformation, and storage of information across three levels of abstraction:</w:t>
+        <w:t>Data Flow Diagrams illustrate how information moves through the application across three levels:</w:t>
       </w:r>
     </w:p>
     <w:p>
@@ -210,7 +210,7 @@
       <w:r>
         <w:drawing>
           <wp:inline xmlns:a="http://schemas.openxmlformats.org/drawingml/2006/main" xmlns:pic="http://schemas.openxmlformats.org/drawingml/2006/picture">
-            <wp:extent cx="4023360" cy="2102572"/>
+            <wp:extent cx="3383280" cy="1768072"/>
             <wp:docPr id="1" name="Picture 1"/>
             <wp:cNvGraphicFramePr>
               <a:graphicFrameLocks noChangeAspect="1"/>
@@ -231,7 +231,7 @@
                   <pic:spPr>
                     <a:xfrm>
                       <a:off x="0" y="0"/>
-                      <a:ext cx="4023360" cy="2102572"/>
+                      <a:ext cx="3383280" cy="1768072"/>
                     </a:xfrm>
                     <a:prstGeom prst="rect"/>
                   </pic:spPr>
@@ -269,7 +269,7 @@
           <w:color w:val="000000"/>
           <w:sz w:val="24"/>
         </w:rPr>
-        <w:t>The Context Level Diagram (Level 0) represents the platform as a centralized system interacting with Item Owners, Borrowers, Community Members, and Administrators.</w:t>
+        <w:t>The Context Level Diagram (Level 0) represents the platform interacting with Item Owners, Borrowers, Community Members, and Administrators.</w:t>
       </w:r>
     </w:p>
     <w:p>
@@ -281,7 +281,7 @@
       <w:r>
         <w:drawing>
           <wp:inline xmlns:a="http://schemas.openxmlformats.org/drawingml/2006/main" xmlns:pic="http://schemas.openxmlformats.org/drawingml/2006/picture">
-            <wp:extent cx="4023360" cy="2127236"/>
+            <wp:extent cx="3383280" cy="1788812"/>
             <wp:docPr id="2" name="Picture 2"/>
             <wp:cNvGraphicFramePr>
               <a:graphicFrameLocks noChangeAspect="1"/>
@@ -302,7 +302,7 @@
                   <pic:spPr>
                     <a:xfrm>
                       <a:off x="0" y="0"/>
-                      <a:ext cx="4023360" cy="2127236"/>
+                      <a:ext cx="3383280" cy="1788812"/>
                     </a:xfrm>
                     <a:prstGeom prst="rect"/>
                   </pic:spPr>
@@ -340,7 +340,7 @@
           <w:color w:val="000000"/>
           <w:sz w:val="24"/>
         </w:rPr>
-        <w:t>The Level 1 DFD decomposes the system into four core functional subsystems: (1.0) User Auth, (2.0) Item Catalog, (3.0) Search Engine, and (4.0) Lending Workflow Engine interacting with data stores D1, D2, and D3.</w:t>
+        <w:t>The Level 1 DFD decomposes the system into four functional subsystems: (1.0) User Auth, (2.0) Item Catalog, (3.0) Search Engine, and (4.0) Lending Workflow Engine interacting with data stores D1, D2, and D3.</w:t>
       </w:r>
     </w:p>
     <w:p>
@@ -352,7 +352,7 @@
       <w:r>
         <w:drawing>
           <wp:inline xmlns:a="http://schemas.openxmlformats.org/drawingml/2006/main" xmlns:pic="http://schemas.openxmlformats.org/drawingml/2006/picture">
-            <wp:extent cx="4023360" cy="2028572"/>
+            <wp:extent cx="3383280" cy="1705844"/>
             <wp:docPr id="3" name="Picture 3"/>
             <wp:cNvGraphicFramePr>
               <a:graphicFrameLocks noChangeAspect="1"/>
@@ -373,7 +373,7 @@
                   <pic:spPr>
                     <a:xfrm>
                       <a:off x="0" y="0"/>
-                      <a:ext cx="4023360" cy="2028572"/>
+                      <a:ext cx="3383280" cy="1705844"/>
                     </a:xfrm>
                     <a:prstGeom prst="rect"/>
                   </pic:spPr>
@@ -411,7 +411,7 @@
           <w:color w:val="000000"/>
           <w:sz w:val="24"/>
         </w:rPr>
-        <w:t>The Level 2 DFD outlines the borrowing lifecycle: validating availability, creating a pending request record, processing owner approval/rejection, and confirming returns.</w:t>
+        <w:t>The Level 2 DFD outlines the complete borrow request lifecycle: checking item availability, creating a pending request, owner decision, and return confirmation.</w:t>
       </w:r>
     </w:p>
     <w:p>
@@ -440,7 +440,7 @@
           <w:color w:val="000000"/>
           <w:sz w:val="24"/>
         </w:rPr>
-        <w:t>UML models illustrate system behavioral use cases and structural object relationships:</w:t>
+        <w:t>UML models depict system functional interactions and object structures:</w:t>
       </w:r>
     </w:p>
     <w:p>
@@ -452,7 +452,7 @@
       <w:r>
         <w:drawing>
           <wp:inline xmlns:a="http://schemas.openxmlformats.org/drawingml/2006/main" xmlns:pic="http://schemas.openxmlformats.org/drawingml/2006/picture">
-            <wp:extent cx="4023360" cy="2243635"/>
+            <wp:extent cx="3383280" cy="1886693"/>
             <wp:docPr id="4" name="Picture 4"/>
             <wp:cNvGraphicFramePr>
               <a:graphicFrameLocks noChangeAspect="1"/>
@@ -473,7 +473,7 @@
                   <pic:spPr>
                     <a:xfrm>
                       <a:off x="0" y="0"/>
-                      <a:ext cx="4023360" cy="2243635"/>
+                      <a:ext cx="3383280" cy="1886693"/>
                     </a:xfrm>
                     <a:prstGeom prst="rect"/>
                   </pic:spPr>
@@ -511,7 +511,7 @@
           <w:color w:val="000000"/>
           <w:sz w:val="24"/>
         </w:rPr>
-        <w:t>The Use Case Diagram defines functional user actions across the Item Owner, Borrower, and Administrator roles within the platform boundary.</w:t>
+        <w:t>The Use Case Diagram defines functional interactions across Item Owner, Borrower, and Administrator roles within the system boundary.</w:t>
       </w:r>
     </w:p>
     <w:p>
@@ -523,7 +523,7 @@
       <w:r>
         <w:drawing>
           <wp:inline xmlns:a="http://schemas.openxmlformats.org/drawingml/2006/main" xmlns:pic="http://schemas.openxmlformats.org/drawingml/2006/picture">
-            <wp:extent cx="4023360" cy="2243635"/>
+            <wp:extent cx="3383280" cy="1886693"/>
             <wp:docPr id="5" name="Picture 5"/>
             <wp:cNvGraphicFramePr>
               <a:graphicFrameLocks noChangeAspect="1"/>
@@ -544,7 +544,7 @@
                   <pic:spPr>
                     <a:xfrm>
                       <a:off x="0" y="0"/>
-                      <a:ext cx="4023360" cy="2243635"/>
+                      <a:ext cx="3383280" cy="1886693"/>
                     </a:xfrm>
                     <a:prstGeom prst="rect"/>
                   </pic:spPr>
@@ -582,7 +582,7 @@
           <w:color w:val="000000"/>
           <w:sz w:val="24"/>
         </w:rPr>
-        <w:t>The Class Diagram details the structural classes: `User`, `Item`, and `LendingRequest` with attributes, methods, and multiplicities (`1..* Lists`, `1..* Initiates`).</w:t>
+        <w:t>The Class Diagram details the core entity classes: `User`, `Item`, and `LendingRequest` with attributes, methods, and associations (`1..* Lists`, `1..* Initiates`).</w:t>
       </w:r>
     </w:p>
     <w:p>
@@ -611,7 +611,7 @@
           <w:color w:val="000000"/>
           <w:sz w:val="24"/>
         </w:rPr>
-        <w:t>A modular monolithic architecture in Flask was selected over microservices for zero inter-module latency, ACID transactions, and lower hosting complexity:</w:t>
+        <w:t>A modular monolith web architecture using Python Flask was selected instead of complex microservices. This choice allows faster development, keeps all database transactions reliable with ACID guarantees, and makes cloud deployment simple and cost-effective on free-tier services:</w:t>
       </w:r>
     </w:p>
     <w:tbl>
@@ -928,7 +928,7 @@
                 <w:color w:val="000000"/>
                 <w:sz w:val="17"/>
               </w:rPr>
-              <w:t>4 / 10 (Multi-container orchestration)</w:t>
+              <w:t>4 / 10 (Multi-container setup)</w:t>
             </w:r>
           </w:p>
         </w:tc>
@@ -1258,7 +1258,7 @@
           <w:color w:val="000000"/>
           <w:sz w:val="24"/>
         </w:rPr>
-        <w:t>The database tier uses MySQL 8.0 deployed on TiDB Serverless Cloud. A relational DBMS was selected over NoSQL for strict ACID transaction consistency and foreign key constraints.</w:t>
+        <w:t>The database tier uses MySQL 8.0 on TiDB Serverless Cloud. A relational DBMS was selected over NoSQL for strict ACID transaction consistency and foreign key constraints.</w:t>
       </w:r>
     </w:p>
     <w:p>
@@ -1270,7 +1270,7 @@
       <w:r>
         <w:drawing>
           <wp:inline xmlns:a="http://schemas.openxmlformats.org/drawingml/2006/main" xmlns:pic="http://schemas.openxmlformats.org/drawingml/2006/picture">
-            <wp:extent cx="4023360" cy="2243635"/>
+            <wp:extent cx="3383280" cy="1886693"/>
             <wp:docPr id="6" name="Picture 6"/>
             <wp:cNvGraphicFramePr>
               <a:graphicFrameLocks noChangeAspect="1"/>
@@ -1291,7 +1291,7 @@
                   <pic:spPr>
                     <a:xfrm>
                       <a:off x="0" y="0"/>
-                      <a:ext cx="4023360" cy="2243635"/>
+                      <a:ext cx="3383280" cy="1886693"/>
                     </a:xfrm>
                     <a:prstGeom prst="rect"/>
                   </pic:spPr>
@@ -1360,7 +1360,7 @@
           <w:color w:val="000000"/>
           <w:sz w:val="24"/>
         </w:rPr>
-        <w:t xml:space="preserve">1NF: </w:t>
+        <w:t xml:space="preserve">1NF (First Normal Form): </w:t>
       </w:r>
       <w:r>
         <w:rPr>
@@ -1368,7 +1368,7 @@
           <w:color w:val="000000"/>
           <w:sz w:val="24"/>
         </w:rPr>
-        <w:t>All attributes contain atomic values; repeating groups are eliminated with primary keys (`id`).</w:t>
+        <w:t>All table columns contain atomic, indivisible values; repeating groups are eliminated with primary keys (`id`).</w:t>
       </w:r>
     </w:p>
     <w:p>
@@ -1384,7 +1384,7 @@
           <w:color w:val="000000"/>
           <w:sz w:val="24"/>
         </w:rPr>
-        <w:t xml:space="preserve">2NF: </w:t>
+        <w:t xml:space="preserve">2NF (Second Normal Form): </w:t>
       </w:r>
       <w:r>
         <w:rPr>
@@ -1392,7 +1392,7 @@
           <w:color w:val="000000"/>
           <w:sz w:val="24"/>
         </w:rPr>
-        <w:t>Satisfies 1NF with zero partial key dependencies; non-key columns depend on the whole primary key.</w:t>
+        <w:t>Satisfies 1NF with zero partial key dependencies; all non-key columns depend on the entire primary key.</w:t>
       </w:r>
     </w:p>
     <w:p>
@@ -1408,7 +1408,7 @@
           <w:color w:val="000000"/>
           <w:sz w:val="24"/>
         </w:rPr>
-        <w:t xml:space="preserve">3NF: </w:t>
+        <w:t xml:space="preserve">3NF (Third Normal Form): </w:t>
       </w:r>
       <w:r>
         <w:rPr>
@@ -1416,7 +1416,7 @@
           <w:color w:val="000000"/>
           <w:sz w:val="24"/>
         </w:rPr>
-        <w:t>Satisfies 2NF with zero transitive dependencies; non-key columns depend solely on the primary key.</w:t>
+        <w:t>Satisfies 2NF with zero transitive dependencies; non-key columns depend solely on primary keys.</w:t>
       </w:r>
     </w:p>
     <w:p>
@@ -2345,7 +2345,7 @@
                 <w:color w:val="000000"/>
                 <w:sz w:val="17"/>
               </w:rPr>
-              <w:t>Creation timestamp</w:t>
+              <w:t>Account creation timestamp</w:t>
             </w:r>
           </w:p>
         </w:tc>
@@ -3384,7 +3384,7 @@
                 <w:color w:val="000000"/>
                 <w:sz w:val="17"/>
               </w:rPr>
-              <w:t>Creation timestamp</w:t>
+              <w:t>Listing creation timestamp</w:t>
             </w:r>
           </w:p>
         </w:tc>

</xml_diff>